<commit_message>
Point the guide at the live site and tighten the wording
- Use https://australia-digital-assets-framework.vercel.app as the site
  address: the old -ten address returns 404, which broke the thread
  link, og:url and the social card.
- Say Redbelly's tools can enforce eligibility rules instead of saying
  they match the Act, and keep the duty to make the rules transparent
  and non-discriminatory with the platform operator.
- Thread: the operator needs the licence; a business that misses the
  7 October 2027 deadline is covered once the window closes.
- Put "General information, not legal advice" on the PDF cover.
- Give the 404 page's skip link a target.
- Fix folder names in requirements.txt and the README tree.
</commit_message>
<xml_diff>
--- a/site/downloads/digital-assets-framework-guide.docx
+++ b/site/downloads/digital-assets-framework-guide.docx
@@ -422,7 +422,7 @@
         <w:t xml:space="preserve"> </w:t>
       </w:r>
       <w:r>
-        <w:t xml:space="preserve">Its identity and eligibility tools match the Act’s requirement for transparent, non-discriminatory eligibility rules</w:t>
+        <w:t xml:space="preserve">Its identity and eligibility tools can enforce the kind of eligibility rules the Act asks platforms to set out, though the platform operator still has to make those rules transparent and non-discriminatory</w:t>
       </w:r>
       <w:r>
         <w:rPr>
@@ -4074,7 +4074,7 @@
         <w:pStyle w:val="FirstParagraph"/>
       </w:pPr>
       <w:r>
-        <w:t xml:space="preserve">Saved copies of every source, with SHA-256 fingerprints, are published with the online guide at https://australia-digital-assets-framework-ten.vercel.app/source-list.html.</w:t>
+        <w:t xml:space="preserve">Saved copies of every source, with SHA-256 fingerprints, are published with the online guide at https://australia-digital-assets-framework.vercel.app/source-list.html.</w:t>
       </w:r>
     </w:p>
     <w:p>

</xml_diff>